<commit_message>
Added Audio Files + Documentation shows to do
</commit_message>
<xml_diff>
--- a/Games Audio Design Documentation.docx
+++ b/Games Audio Design Documentation.docx
@@ -26,12 +26,43 @@
     </w:p>
     <w:p>
       <w:r>
-        <w:t xml:space="preserve">For the games in level, diegetic audio the main sound profile should be that of stone (As most of the level is made of stone). Most of the games Diegetic audio are quick impulse noises that only play when their corresponding object is moves or interacted with. </w:t>
+        <w:t xml:space="preserve">For the games in </w:t>
+      </w:r>
+      <w:r>
+        <w:t xml:space="preserve">the </w:t>
+      </w:r>
+      <w:r>
+        <w:t>level, diegetic audio</w:t>
+      </w:r>
+      <w:r>
+        <w:t>,</w:t>
+      </w:r>
+      <w:r>
+        <w:t xml:space="preserve"> the main sound profile should be that of stone (As most of the level is made of stone). Most of the </w:t>
+      </w:r>
+      <w:r>
+        <w:t>games' diegetic</w:t>
+      </w:r>
+      <w:r>
+        <w:t xml:space="preserve"> audio </w:t>
+      </w:r>
+      <w:r>
+        <w:t>is</w:t>
+      </w:r>
+      <w:r>
+        <w:t xml:space="preserve"> quick impulse noises that only play when their corresponding object is </w:t>
+      </w:r>
+      <w:r>
+        <w:t>moved</w:t>
+      </w:r>
+      <w:r>
+        <w:t xml:space="preserve"> or interacted with. </w:t>
       </w:r>
     </w:p>
     <w:p>
       <w:r>
         <w:rPr>
+          <w:highlight w:val="green"/>
           <w:u w:val="single"/>
         </w:rPr>
         <w:t>Floor</w:t>
@@ -60,7 +91,13 @@
       </w:r>
       <w:proofErr w:type="spellEnd"/>
       <w:r>
-        <w:t xml:space="preserve"> walks on it but not when </w:t>
+        <w:t xml:space="preserve"> walks on it</w:t>
+      </w:r>
+      <w:r>
+        <w:t>,</w:t>
+      </w:r>
+      <w:r>
+        <w:t xml:space="preserve"> but not when </w:t>
       </w:r>
       <w:proofErr w:type="spellStart"/>
       <w:r>
@@ -78,6 +115,7 @@
     <w:p>
       <w:r>
         <w:rPr>
+          <w:highlight w:val="green"/>
           <w:u w:val="single"/>
         </w:rPr>
         <w:t>Enter</w:t>
@@ -92,6 +130,7 @@
     <w:p>
       <w:r>
         <w:rPr>
+          <w:highlight w:val="green"/>
           <w:u w:val="single"/>
         </w:rPr>
         <w:t>Exit</w:t>
@@ -114,15 +153,20 @@
     <w:p>
       <w:r>
         <w:rPr>
+          <w:highlight w:val="green"/>
           <w:u w:val="single"/>
         </w:rPr>
         <w:t>Push</w:t>
       </w:r>
       <w:r>
+        <w:rPr>
+          <w:highlight w:val="green"/>
+        </w:rPr>
         <w:t xml:space="preserve"> </w:t>
       </w:r>
       <w:r>
         <w:rPr>
+          <w:highlight w:val="green"/>
           <w:u w:val="single"/>
         </w:rPr>
         <w:t>Block</w:t>
@@ -139,6 +183,7 @@
       <w:proofErr w:type="gramStart"/>
       <w:r>
         <w:rPr>
+          <w:highlight w:val="green"/>
           <w:u w:val="single"/>
         </w:rPr>
         <w:t>P.Plate</w:t>
@@ -149,20 +194,19 @@
         <w:t xml:space="preserve"> – </w:t>
       </w:r>
       <w:r>
-        <w:t xml:space="preserve">A faint, one note </w:t>
-      </w:r>
-      <w:proofErr w:type="gramStart"/>
-      <w:r>
-        <w:t>pan</w:t>
-      </w:r>
-      <w:proofErr w:type="gramEnd"/>
-      <w:r>
-        <w:t xml:space="preserve"> flute cue</w:t>
+        <w:t xml:space="preserve">A faint, </w:t>
+      </w:r>
+      <w:r>
+        <w:t>one-note</w:t>
+      </w:r>
+      <w:r>
+        <w:t xml:space="preserve"> pan flute cue</w:t>
       </w:r>
     </w:p>
     <w:p>
       <w:r>
         <w:rPr>
+          <w:highlight w:val="green"/>
           <w:u w:val="single"/>
         </w:rPr>
         <w:t>Button</w:t>
@@ -174,15 +218,16 @@
         <w:t xml:space="preserve">A faint, </w:t>
       </w:r>
       <w:r>
-        <w:t>two</w:t>
-      </w:r>
-      <w:r>
-        <w:t xml:space="preserve"> note pan flute cue</w:t>
+        <w:t>two-note</w:t>
+      </w:r>
+      <w:r>
+        <w:t xml:space="preserve"> pan flute cue</w:t>
       </w:r>
     </w:p>
     <w:p>
       <w:r>
         <w:rPr>
+          <w:highlight w:val="green"/>
           <w:u w:val="single"/>
         </w:rPr>
         <w:t>Bridge</w:t>
@@ -200,6 +245,7 @@
     <w:p>
       <w:r>
         <w:rPr>
+          <w:highlight w:val="green"/>
           <w:u w:val="single"/>
         </w:rPr>
         <w:t>Death</w:t>
@@ -214,23 +260,19 @@
         <w:t xml:space="preserve"> </w:t>
       </w:r>
       <w:r>
-        <w:t xml:space="preserve">A 3 note </w:t>
-      </w:r>
-      <w:proofErr w:type="spellStart"/>
-      <w:r>
-        <w:t>desention</w:t>
-      </w:r>
-      <w:proofErr w:type="spellEnd"/>
-      <w:r>
-        <w:t xml:space="preserve"> on </w:t>
-      </w:r>
-      <w:r>
-        <w:t>pan flute</w:t>
+        <w:t xml:space="preserve">A </w:t>
+      </w:r>
+      <w:r>
+        <w:t>3-note descent</w:t>
+      </w:r>
+      <w:r>
+        <w:t xml:space="preserve"> on pan flute</w:t>
       </w:r>
     </w:p>
     <w:p>
       <w:r>
         <w:rPr>
+          <w:highlight w:val="red"/>
           <w:u w:val="single"/>
         </w:rPr>
         <w:t>Environmental noises</w:t>
@@ -258,6 +300,7 @@
     <w:p>
       <w:r>
         <w:rPr>
+          <w:highlight w:val="red"/>
           <w:u w:val="single"/>
         </w:rPr>
         <w:t xml:space="preserve">Sound </w:t>
@@ -265,12 +308,14 @@
       <w:proofErr w:type="gramStart"/>
       <w:r>
         <w:rPr>
+          <w:highlight w:val="red"/>
           <w:u w:val="single"/>
         </w:rPr>
         <w:t>Track</w:t>
       </w:r>
       <w:r>
         <w:rPr>
+          <w:highlight w:val="red"/>
           <w:u w:val="single"/>
         </w:rPr>
         <w:t xml:space="preserve"> ??</w:t>
@@ -299,6 +344,7 @@
     <w:p>
       <w:r>
         <w:rPr>
+          <w:highlight w:val="red"/>
           <w:u w:val="single"/>
         </w:rPr>
         <w:t>Button click</w:t>
@@ -313,6 +359,7 @@
     <w:p>
       <w:r>
         <w:rPr>
+          <w:highlight w:val="red"/>
           <w:u w:val="single"/>
         </w:rPr>
         <w:t>Hover</w:t>

</xml_diff>